<commit_message>
Deploying to gh-pages from @ Morrison-Lab/mds@87000cca871a97c7651c210db6f9533711b68f64 🚀
</commit_message>
<xml_diff>
--- a/optimization.docx
+++ b/optimization.docx
@@ -15,7 +15,7 @@
         <w:pStyle w:val="Date"/>
       </w:pPr>
       <w:r>
-        <w:t xml:space="preserve">Last modified: 2026-10-18 16:43:42 (PDT)</w:t>
+        <w:t xml:space="preserve">Last modified: 2026-10-19 00:47:50 (PDT)</w:t>
       </w:r>
     </w:p>
     <w:bookmarkStart w:id="73" w:name="sec-optimality-vector"/>
@@ -5009,7 +5009,7 @@
         <w:rPr>
           <w:rStyle w:val="CommentTok"/>
         </w:rPr>
-        <w:t xml:space="preserve">#&gt; solution     [39.935861021170574, -0.1578447333536545]  [1.071498445526231e-11, 1.673470251262188e-10]</w:t>
+        <w:t xml:space="preserve">#&gt; solution     [39.93586102117057, -0.15784473335365445]  [9.471534667682135e-12, 6.662048690486699e-11]</w:t>
       </w:r>
       <w:r>
         <w:br/>
@@ -5878,7 +5878,7 @@
         <w:rPr>
           <w:rStyle w:val="CommentTok"/>
         </w:rPr>
-        <w:t xml:space="preserve">#&gt; [1] 1.071498e-11 1.673470e-10</w:t>
+        <w:t xml:space="preserve">#&gt; [1] 9.471535e-12 6.662049e-11</w:t>
       </w:r>
       <w:r>
         <w:br/>
@@ -6061,7 +6061,7 @@
         <w:t xml:space="preserve"> </w:t>
       </w:r>
       <w:r>
-        <w:t xml:space="preserve">1.7e-10,</w:t>
+        <w:t xml:space="preserve">6.7e-11,</w:t>
       </w:r>
       <w:r>
         <w:t xml:space="preserve"> </w:t>

</xml_diff>